<commit_message>
feat: assinatura digital ICP-Brasil (A1/A3), novos campos de profissionais e ajustes de seguranca no .gitignore
</commit_message>
<xml_diff>
--- a/modelosRelatorios/_RelatorioTemplateCamila.docx
+++ b/modelosRelatorios/_RelatorioTemplateCamila.docx
@@ -1,6 +1,6 @@
 
 <file path=word/document.xml><?xml version="1.0" encoding="utf-8"?>
-<w:document xmlns:wpc="http://schemas.microsoft.com/office/word/2010/wordprocessingCanvas" xmlns:cx="http://schemas.microsoft.com/office/drawing/2014/chartex" xmlns:cx1="http://schemas.microsoft.com/office/drawing/2015/9/8/chartex" xmlns:cx2="http://schemas.microsoft.com/office/drawing/2015/10/21/chartex" xmlns:cx3="http://schemas.microsoft.com/office/drawing/2016/5/9/chartex" xmlns:cx4="http://schemas.microsoft.com/office/drawing/2016/5/10/chartex" xmlns:cx5="http://schemas.microsoft.com/office/drawing/2016/5/11/chartex" xmlns:cx6="http://schemas.microsoft.com/office/drawing/2016/5/12/chartex" xmlns:cx7="http://schemas.microsoft.com/office/drawing/2016/5/13/chartex" xmlns:cx8="http://schemas.microsoft.com/office/drawing/2016/5/14/chartex" xmlns:mc="http://schemas.openxmlformats.org/markup-compatibility/2006" xmlns:aink="http://schemas.microsoft.com/office/drawing/2016/ink" xmlns:am3d="http://schemas.microsoft.com/office/drawing/2017/model3d" xmlns:o="urn:schemas-microsoft-com:office:office" xmlns:oel="http://schemas.microsoft.com/office/2019/extlst" xmlns:r="http://schemas.openxmlformats.org/officeDocument/2006/relationships" xmlns:m="http://schemas.openxmlformats.org/officeDocument/2006/math" xmlns:v="urn:schemas-microsoft-com:vml" xmlns:wp14="http://schemas.microsoft.com/office/word/2010/wordprocessingDrawing" xmlns:wp="http://schemas.openxmlformats.org/drawingml/2006/wordprocessingDrawing" xmlns:w10="urn:schemas-microsoft-com:office:word" xmlns:w="http://schemas.openxmlformats.org/wordprocessingml/2006/main" xmlns:w14="http://schemas.microsoft.com/office/word/2010/wordml" xmlns:w15="http://schemas.microsoft.com/office/word/2012/wordml" xmlns:w16cex="http://schemas.microsoft.com/office/word/2018/wordml/cex" xmlns:w16cid="http://schemas.microsoft.com/office/word/2016/wordml/cid" xmlns:w16="http://schemas.microsoft.com/office/word/2018/wordml" xmlns:w16du="http://schemas.microsoft.com/office/word/2023/wordml/word16du" xmlns:w16sdtdh="http://schemas.microsoft.com/office/word/2020/wordml/sdtdatahash" xmlns:w16sdtfl="http://schemas.microsoft.com/office/word/2024/wordml/sdtformatlock" xmlns:w16se="http://schemas.microsoft.com/office/word/2015/wordml/symex" xmlns:wpg="http://schemas.microsoft.com/office/word/2010/wordprocessingGroup" xmlns:wpi="http://schemas.microsoft.com/office/word/2010/wordprocessingInk" xmlns:wne="http://schemas.microsoft.com/office/word/2006/wordml" xmlns:wps="http://schemas.microsoft.com/office/word/2010/wordprocessingShape" mc:Ignorable="w14 w15 w16se w16cid w16 w16cex w16sdtdh w16sdtfl w16du wp14">
+<w:document xmlns:wpc="http://schemas.microsoft.com/office/word/2010/wordprocessingCanvas" xmlns:cx="http://schemas.microsoft.com/office/drawing/2014/chartex" xmlns:cx1="http://schemas.microsoft.com/office/drawing/2015/9/8/chartex" xmlns:cx2="http://schemas.microsoft.com/office/drawing/2015/10/21/chartex" xmlns:cx3="http://schemas.microsoft.com/office/drawing/2016/5/9/chartex" xmlns:cx4="http://schemas.microsoft.com/office/drawing/2016/5/10/chartex" xmlns:cx5="http://schemas.microsoft.com/office/drawing/2016/5/11/chartex" xmlns:cx6="http://schemas.microsoft.com/office/drawing/2016/5/12/chartex" xmlns:cx7="http://schemas.microsoft.com/office/drawing/2016/5/13/chartex" xmlns:cx8="http://schemas.microsoft.com/office/drawing/2016/5/14/chartex" xmlns:mc="http://schemas.openxmlformats.org/markup-compatibility/2006" xmlns:aink="http://schemas.microsoft.com/office/drawing/2016/ink" xmlns:am3d="http://schemas.microsoft.com/office/drawing/2017/model3d" xmlns:o="urn:schemas-microsoft-com:office:office" xmlns:oel="http://schemas.microsoft.com/office/2019/extlst" xmlns:r="http://schemas.openxmlformats.org/officeDocument/2006/relationships" xmlns:m="http://schemas.openxmlformats.org/officeDocument/2006/math" xmlns:v="urn:schemas-microsoft-com:vml" xmlns:wp14="http://schemas.microsoft.com/office/word/2010/wordprocessingDrawing" xmlns:wp="http://schemas.openxmlformats.org/drawingml/2006/wordprocessingDrawing" xmlns:w10="urn:schemas-microsoft-com:office:word" xmlns:w="http://schemas.openxmlformats.org/wordprocessingml/2006/main" xmlns:w14="http://schemas.microsoft.com/office/word/2010/wordml" xmlns:w15="http://schemas.microsoft.com/office/word/2012/wordml" xmlns:w16cex="http://schemas.microsoft.com/office/word/2018/wordml/cex" xmlns:w16cid="http://schemas.microsoft.com/office/word/2016/wordml/cid" xmlns:w16="http://schemas.microsoft.com/office/word/2018/wordml" xmlns:w16sdtdh="http://schemas.microsoft.com/office/word/2020/wordml/sdtdatahash" xmlns:w16se="http://schemas.microsoft.com/office/word/2015/wordml/symex" xmlns:wpg="http://schemas.microsoft.com/office/word/2010/wordprocessingGroup" xmlns:wpi="http://schemas.microsoft.com/office/word/2010/wordprocessingInk" xmlns:wne="http://schemas.microsoft.com/office/word/2006/wordml" xmlns:wps="http://schemas.microsoft.com/office/word/2010/wordprocessingShape" mc:Ignorable="w14 w15 w16se w16cid w16 w16cex w16sdtdh wp14">
   <w:body>
     <w:p>
       <w:pPr>
@@ -40,7 +40,23 @@
           <w:sz w:val="24"/>
           <w:szCs w:val="24"/>
         </w:rPr>
-        <w:t xml:space="preserve">Relatório para fins de reembolso de sessões de Psicoterapia individual </w:t>
+        <w:t>Relatório para fins de reembolso de sessões de Psicoterapia individual</w:t>
+      </w:r>
+      <w:r>
+        <w:rPr>
+          <w:color w:val="1F3864"/>
+          <w:sz w:val="24"/>
+          <w:szCs w:val="24"/>
+        </w:rPr>
+        <w:t>.</w:t>
+      </w:r>
+      <w:r>
+        <w:rPr>
+          <w:color w:val="1F3864"/>
+          <w:sz w:val="24"/>
+          <w:szCs w:val="24"/>
+        </w:rPr>
+        <w:t xml:space="preserve"> </w:t>
       </w:r>
     </w:p>
     <w:p>
@@ -269,7 +285,16 @@
           <w:sz w:val="24"/>
           <w:szCs w:val="24"/>
         </w:rPr>
-        <w:t xml:space="preserve"> sessões</w:t>
+        <w:t xml:space="preserve"> </w:t>
+      </w:r>
+      <w:proofErr w:type="spellStart"/>
+      <w:r>
+        <w:rPr>
+          <w:color w:val="1F3864"/>
+          <w:sz w:val="24"/>
+          <w:szCs w:val="24"/>
+        </w:rPr>
+        <w:t>sessões</w:t>
       </w:r>
       <w:bookmarkStart w:id="4" w:name="FormaPresencial"/>
       <w:r>
@@ -305,6 +330,7 @@
         <w:t>resencial</w:t>
       </w:r>
       <w:bookmarkEnd w:id="4"/>
+      <w:proofErr w:type="spellEnd"/>
       <w:r>
         <w:rPr>
           <w:color w:val="1F3864"/>
@@ -366,7 +392,7 @@
           <w:sz w:val="24"/>
           <w:szCs w:val="24"/>
         </w:rPr>
-        <w:t xml:space="preserve">Osasco, </w:t>
+        <w:t>Osasco, #DataAssinatura.</w:t>
       </w:r>
       <w:bookmarkStart w:id="7" w:name="UltDiaMesConsultas"/>
       <w:r>
@@ -375,7 +401,6 @@
           <w:sz w:val="24"/>
           <w:szCs w:val="24"/>
         </w:rPr>
-        <w:t>#UltDiaMesConsultas</w:t>
       </w:r>
       <w:bookmarkEnd w:id="7"/>
       <w:r>
@@ -384,7 +409,6 @@
           <w:sz w:val="24"/>
           <w:szCs w:val="24"/>
         </w:rPr>
-        <w:t xml:space="preserve"> de </w:t>
       </w:r>
       <w:bookmarkStart w:id="8" w:name="MesDasConsultas2"/>
       <w:r>
@@ -393,15 +417,13 @@
           <w:sz w:val="24"/>
           <w:szCs w:val="24"/>
         </w:rPr>
-        <w:t>#MesDasConsultas</w:t>
-      </w:r>
-      <w:r>
-        <w:rPr>
-          <w:color w:val="1F3864"/>
-          <w:sz w:val="24"/>
-          <w:szCs w:val="24"/>
-        </w:rPr>
-        <w:t>2</w:t>
+      </w:r>
+      <w:r>
+        <w:rPr>
+          <w:color w:val="1F3864"/>
+          <w:sz w:val="24"/>
+          <w:szCs w:val="24"/>
+        </w:rPr>
       </w:r>
       <w:bookmarkEnd w:id="8"/>
       <w:r>
@@ -410,15 +432,13 @@
           <w:sz w:val="24"/>
           <w:szCs w:val="24"/>
         </w:rPr>
-        <w:t xml:space="preserve"> </w:t>
-      </w:r>
-      <w:r>
-        <w:rPr>
-          <w:color w:val="1F3864"/>
-          <w:sz w:val="24"/>
-          <w:szCs w:val="24"/>
-        </w:rPr>
-        <w:t xml:space="preserve">de </w:t>
+      </w:r>
+      <w:r>
+        <w:rPr>
+          <w:color w:val="1F3864"/>
+          <w:sz w:val="24"/>
+          <w:szCs w:val="24"/>
+        </w:rPr>
       </w:r>
       <w:bookmarkStart w:id="9" w:name="AnoDasConsultas2"/>
       <w:r>
@@ -427,7 +447,6 @@
           <w:sz w:val="24"/>
           <w:szCs w:val="24"/>
         </w:rPr>
-        <w:t>#AnoDasConsultas2</w:t>
       </w:r>
       <w:bookmarkEnd w:id="9"/>
       <w:r>
@@ -436,7 +455,6 @@
           <w:sz w:val="24"/>
           <w:szCs w:val="24"/>
         </w:rPr>
-        <w:t>.</w:t>
       </w:r>
     </w:p>
     <w:p>
@@ -504,8 +522,12 @@
       </w:r>
     </w:p>
     <w:sectPr>
-      <w:headerReference w:type="default" r:id="rId9"/>
-      <w:footerReference w:type="default" r:id="rId10"/>
+      <w:headerReference w:type="even" r:id="rId9"/>
+      <w:headerReference w:type="default" r:id="rId10"/>
+      <w:footerReference w:type="even" r:id="rId11"/>
+      <w:footerReference w:type="default" r:id="rId12"/>
+      <w:headerReference w:type="first" r:id="rId13"/>
+      <w:footerReference w:type="first" r:id="rId14"/>
       <w:pgSz w:w="11907" w:h="16840" w:code="9"/>
       <w:pgMar w:top="1701" w:right="1701" w:bottom="1701" w:left="1701" w:header="737" w:footer="0" w:gutter="0"/>
       <w:pgNumType w:start="1"/>
@@ -517,7 +539,7 @@
 </file>
 
 <file path=word/endnotes.xml><?xml version="1.0" encoding="utf-8"?>
-<w:endnotes xmlns:wpc="http://schemas.microsoft.com/office/word/2010/wordprocessingCanvas" xmlns:cx="http://schemas.microsoft.com/office/drawing/2014/chartex" xmlns:cx1="http://schemas.microsoft.com/office/drawing/2015/9/8/chartex" xmlns:cx2="http://schemas.microsoft.com/office/drawing/2015/10/21/chartex" xmlns:cx3="http://schemas.microsoft.com/office/drawing/2016/5/9/chartex" xmlns:cx4="http://schemas.microsoft.com/office/drawing/2016/5/10/chartex" xmlns:cx5="http://schemas.microsoft.com/office/drawing/2016/5/11/chartex" xmlns:cx6="http://schemas.microsoft.com/office/drawing/2016/5/12/chartex" xmlns:cx7="http://schemas.microsoft.com/office/drawing/2016/5/13/chartex" xmlns:cx8="http://schemas.microsoft.com/office/drawing/2016/5/14/chartex" xmlns:mc="http://schemas.openxmlformats.org/markup-compatibility/2006" xmlns:aink="http://schemas.microsoft.com/office/drawing/2016/ink" xmlns:am3d="http://schemas.microsoft.com/office/drawing/2017/model3d" xmlns:o="urn:schemas-microsoft-com:office:office" xmlns:oel="http://schemas.microsoft.com/office/2019/extlst" xmlns:r="http://schemas.openxmlformats.org/officeDocument/2006/relationships" xmlns:m="http://schemas.openxmlformats.org/officeDocument/2006/math" xmlns:v="urn:schemas-microsoft-com:vml" xmlns:wp14="http://schemas.microsoft.com/office/word/2010/wordprocessingDrawing" xmlns:wp="http://schemas.openxmlformats.org/drawingml/2006/wordprocessingDrawing" xmlns:w10="urn:schemas-microsoft-com:office:word" xmlns:w="http://schemas.openxmlformats.org/wordprocessingml/2006/main" xmlns:w14="http://schemas.microsoft.com/office/word/2010/wordml" xmlns:w15="http://schemas.microsoft.com/office/word/2012/wordml" xmlns:w16cex="http://schemas.microsoft.com/office/word/2018/wordml/cex" xmlns:w16cid="http://schemas.microsoft.com/office/word/2016/wordml/cid" xmlns:w16="http://schemas.microsoft.com/office/word/2018/wordml" xmlns:w16du="http://schemas.microsoft.com/office/word/2023/wordml/word16du" xmlns:w16sdtdh="http://schemas.microsoft.com/office/word/2020/wordml/sdtdatahash" xmlns:w16sdtfl="http://schemas.microsoft.com/office/word/2024/wordml/sdtformatlock" xmlns:w16se="http://schemas.microsoft.com/office/word/2015/wordml/symex" xmlns:wpg="http://schemas.microsoft.com/office/word/2010/wordprocessingGroup" xmlns:wpi="http://schemas.microsoft.com/office/word/2010/wordprocessingInk" xmlns:wne="http://schemas.microsoft.com/office/word/2006/wordml" xmlns:wps="http://schemas.microsoft.com/office/word/2010/wordprocessingShape" mc:Ignorable="w14 w15 w16se w16cid w16 w16cex w16sdtdh w16sdtfl w16du wp14">
+<w:endnotes xmlns:wpc="http://schemas.microsoft.com/office/word/2010/wordprocessingCanvas" xmlns:cx="http://schemas.microsoft.com/office/drawing/2014/chartex" xmlns:cx1="http://schemas.microsoft.com/office/drawing/2015/9/8/chartex" xmlns:cx2="http://schemas.microsoft.com/office/drawing/2015/10/21/chartex" xmlns:cx3="http://schemas.microsoft.com/office/drawing/2016/5/9/chartex" xmlns:cx4="http://schemas.microsoft.com/office/drawing/2016/5/10/chartex" xmlns:cx5="http://schemas.microsoft.com/office/drawing/2016/5/11/chartex" xmlns:cx6="http://schemas.microsoft.com/office/drawing/2016/5/12/chartex" xmlns:cx7="http://schemas.microsoft.com/office/drawing/2016/5/13/chartex" xmlns:cx8="http://schemas.microsoft.com/office/drawing/2016/5/14/chartex" xmlns:mc="http://schemas.openxmlformats.org/markup-compatibility/2006" xmlns:aink="http://schemas.microsoft.com/office/drawing/2016/ink" xmlns:am3d="http://schemas.microsoft.com/office/drawing/2017/model3d" xmlns:o="urn:schemas-microsoft-com:office:office" xmlns:oel="http://schemas.microsoft.com/office/2019/extlst" xmlns:r="http://schemas.openxmlformats.org/officeDocument/2006/relationships" xmlns:m="http://schemas.openxmlformats.org/officeDocument/2006/math" xmlns:v="urn:schemas-microsoft-com:vml" xmlns:wp14="http://schemas.microsoft.com/office/word/2010/wordprocessingDrawing" xmlns:wp="http://schemas.openxmlformats.org/drawingml/2006/wordprocessingDrawing" xmlns:w10="urn:schemas-microsoft-com:office:word" xmlns:w="http://schemas.openxmlformats.org/wordprocessingml/2006/main" xmlns:w14="http://schemas.microsoft.com/office/word/2010/wordml" xmlns:w15="http://schemas.microsoft.com/office/word/2012/wordml" xmlns:w16cex="http://schemas.microsoft.com/office/word/2018/wordml/cex" xmlns:w16cid="http://schemas.microsoft.com/office/word/2016/wordml/cid" xmlns:w16="http://schemas.microsoft.com/office/word/2018/wordml" xmlns:w16sdtdh="http://schemas.microsoft.com/office/word/2020/wordml/sdtdatahash" xmlns:w16se="http://schemas.microsoft.com/office/word/2015/wordml/symex" xmlns:wpg="http://schemas.microsoft.com/office/word/2010/wordprocessingGroup" xmlns:wpi="http://schemas.microsoft.com/office/word/2010/wordprocessingInk" xmlns:wne="http://schemas.microsoft.com/office/word/2006/wordml" xmlns:wps="http://schemas.microsoft.com/office/word/2010/wordprocessingShape" mc:Ignorable="w14 w15 w16se w16cid w16 w16cex w16sdtdh wp14">
   <w:endnote w:type="separator" w:id="-1">
     <w:p>
       <w:pPr>
@@ -542,7 +564,17 @@
 </file>
 
 <file path=word/footer1.xml><?xml version="1.0" encoding="utf-8"?>
-<w:ftr xmlns:wpc="http://schemas.microsoft.com/office/word/2010/wordprocessingCanvas" xmlns:cx="http://schemas.microsoft.com/office/drawing/2014/chartex" xmlns:cx1="http://schemas.microsoft.com/office/drawing/2015/9/8/chartex" xmlns:cx2="http://schemas.microsoft.com/office/drawing/2015/10/21/chartex" xmlns:cx3="http://schemas.microsoft.com/office/drawing/2016/5/9/chartex" xmlns:cx4="http://schemas.microsoft.com/office/drawing/2016/5/10/chartex" xmlns:cx5="http://schemas.microsoft.com/office/drawing/2016/5/11/chartex" xmlns:cx6="http://schemas.microsoft.com/office/drawing/2016/5/12/chartex" xmlns:cx7="http://schemas.microsoft.com/office/drawing/2016/5/13/chartex" xmlns:cx8="http://schemas.microsoft.com/office/drawing/2016/5/14/chartex" xmlns:mc="http://schemas.openxmlformats.org/markup-compatibility/2006" xmlns:aink="http://schemas.microsoft.com/office/drawing/2016/ink" xmlns:am3d="http://schemas.microsoft.com/office/drawing/2017/model3d" xmlns:o="urn:schemas-microsoft-com:office:office" xmlns:oel="http://schemas.microsoft.com/office/2019/extlst" xmlns:r="http://schemas.openxmlformats.org/officeDocument/2006/relationships" xmlns:m="http://schemas.openxmlformats.org/officeDocument/2006/math" xmlns:v="urn:schemas-microsoft-com:vml" xmlns:wp14="http://schemas.microsoft.com/office/word/2010/wordprocessingDrawing" xmlns:wp="http://schemas.openxmlformats.org/drawingml/2006/wordprocessingDrawing" xmlns:w10="urn:schemas-microsoft-com:office:word" xmlns:w="http://schemas.openxmlformats.org/wordprocessingml/2006/main" xmlns:w14="http://schemas.microsoft.com/office/word/2010/wordml" xmlns:w15="http://schemas.microsoft.com/office/word/2012/wordml" xmlns:w16cex="http://schemas.microsoft.com/office/word/2018/wordml/cex" xmlns:w16cid="http://schemas.microsoft.com/office/word/2016/wordml/cid" xmlns:w16="http://schemas.microsoft.com/office/word/2018/wordml" xmlns:w16du="http://schemas.microsoft.com/office/word/2023/wordml/word16du" xmlns:w16sdtdh="http://schemas.microsoft.com/office/word/2020/wordml/sdtdatahash" xmlns:w16sdtfl="http://schemas.microsoft.com/office/word/2024/wordml/sdtformatlock" xmlns:w16se="http://schemas.microsoft.com/office/word/2015/wordml/symex" xmlns:wpg="http://schemas.microsoft.com/office/word/2010/wordprocessingGroup" xmlns:wpi="http://schemas.microsoft.com/office/word/2010/wordprocessingInk" xmlns:wne="http://schemas.microsoft.com/office/word/2006/wordml" xmlns:wps="http://schemas.microsoft.com/office/word/2010/wordprocessingShape" mc:Ignorable="w14 w15 w16se w16cid w16 w16cex w16sdtdh w16sdtfl w16du wp14">
+<w:ftr xmlns:wpc="http://schemas.microsoft.com/office/word/2010/wordprocessingCanvas" xmlns:cx="http://schemas.microsoft.com/office/drawing/2014/chartex" xmlns:cx1="http://schemas.microsoft.com/office/drawing/2015/9/8/chartex" xmlns:cx2="http://schemas.microsoft.com/office/drawing/2015/10/21/chartex" xmlns:cx3="http://schemas.microsoft.com/office/drawing/2016/5/9/chartex" xmlns:cx4="http://schemas.microsoft.com/office/drawing/2016/5/10/chartex" xmlns:cx5="http://schemas.microsoft.com/office/drawing/2016/5/11/chartex" xmlns:cx6="http://schemas.microsoft.com/office/drawing/2016/5/12/chartex" xmlns:cx7="http://schemas.microsoft.com/office/drawing/2016/5/13/chartex" xmlns:cx8="http://schemas.microsoft.com/office/drawing/2016/5/14/chartex" xmlns:mc="http://schemas.openxmlformats.org/markup-compatibility/2006" xmlns:aink="http://schemas.microsoft.com/office/drawing/2016/ink" xmlns:am3d="http://schemas.microsoft.com/office/drawing/2017/model3d" xmlns:o="urn:schemas-microsoft-com:office:office" xmlns:oel="http://schemas.microsoft.com/office/2019/extlst" xmlns:r="http://schemas.openxmlformats.org/officeDocument/2006/relationships" xmlns:m="http://schemas.openxmlformats.org/officeDocument/2006/math" xmlns:v="urn:schemas-microsoft-com:vml" xmlns:wp14="http://schemas.microsoft.com/office/word/2010/wordprocessingDrawing" xmlns:wp="http://schemas.openxmlformats.org/drawingml/2006/wordprocessingDrawing" xmlns:w10="urn:schemas-microsoft-com:office:word" xmlns:w="http://schemas.openxmlformats.org/wordprocessingml/2006/main" xmlns:w14="http://schemas.microsoft.com/office/word/2010/wordml" xmlns:w15="http://schemas.microsoft.com/office/word/2012/wordml" xmlns:w16cex="http://schemas.microsoft.com/office/word/2018/wordml/cex" xmlns:w16cid="http://schemas.microsoft.com/office/word/2016/wordml/cid" xmlns:w16="http://schemas.microsoft.com/office/word/2018/wordml" xmlns:w16sdtdh="http://schemas.microsoft.com/office/word/2020/wordml/sdtdatahash" xmlns:w16se="http://schemas.microsoft.com/office/word/2015/wordml/symex" xmlns:wpg="http://schemas.microsoft.com/office/word/2010/wordprocessingGroup" xmlns:wpi="http://schemas.microsoft.com/office/word/2010/wordprocessingInk" xmlns:wne="http://schemas.microsoft.com/office/word/2006/wordml" xmlns:wps="http://schemas.microsoft.com/office/word/2010/wordprocessingShape" mc:Ignorable="w14 w15 w16se w16cid w16 w16cex w16sdtdh wp14">
+  <w:p>
+    <w:pPr>
+      <w:pStyle w:val="Rodap"/>
+    </w:pPr>
+  </w:p>
+</w:ftr>
+</file>
+
+<file path=word/footer2.xml><?xml version="1.0" encoding="utf-8"?>
+<w:ftr xmlns:wpc="http://schemas.microsoft.com/office/word/2010/wordprocessingCanvas" xmlns:cx="http://schemas.microsoft.com/office/drawing/2014/chartex" xmlns:cx1="http://schemas.microsoft.com/office/drawing/2015/9/8/chartex" xmlns:cx2="http://schemas.microsoft.com/office/drawing/2015/10/21/chartex" xmlns:cx3="http://schemas.microsoft.com/office/drawing/2016/5/9/chartex" xmlns:cx4="http://schemas.microsoft.com/office/drawing/2016/5/10/chartex" xmlns:cx5="http://schemas.microsoft.com/office/drawing/2016/5/11/chartex" xmlns:cx6="http://schemas.microsoft.com/office/drawing/2016/5/12/chartex" xmlns:cx7="http://schemas.microsoft.com/office/drawing/2016/5/13/chartex" xmlns:cx8="http://schemas.microsoft.com/office/drawing/2016/5/14/chartex" xmlns:mc="http://schemas.openxmlformats.org/markup-compatibility/2006" xmlns:aink="http://schemas.microsoft.com/office/drawing/2016/ink" xmlns:am3d="http://schemas.microsoft.com/office/drawing/2017/model3d" xmlns:o="urn:schemas-microsoft-com:office:office" xmlns:oel="http://schemas.microsoft.com/office/2019/extlst" xmlns:r="http://schemas.openxmlformats.org/officeDocument/2006/relationships" xmlns:m="http://schemas.openxmlformats.org/officeDocument/2006/math" xmlns:v="urn:schemas-microsoft-com:vml" xmlns:wp14="http://schemas.microsoft.com/office/word/2010/wordprocessingDrawing" xmlns:wp="http://schemas.openxmlformats.org/drawingml/2006/wordprocessingDrawing" xmlns:w10="urn:schemas-microsoft-com:office:word" xmlns:w="http://schemas.openxmlformats.org/wordprocessingml/2006/main" xmlns:w14="http://schemas.microsoft.com/office/word/2010/wordml" xmlns:w15="http://schemas.microsoft.com/office/word/2012/wordml" xmlns:w16cex="http://schemas.microsoft.com/office/word/2018/wordml/cex" xmlns:w16cid="http://schemas.microsoft.com/office/word/2016/wordml/cid" xmlns:w16="http://schemas.microsoft.com/office/word/2018/wordml" xmlns:w16sdtdh="http://schemas.microsoft.com/office/word/2020/wordml/sdtdatahash" xmlns:w16se="http://schemas.microsoft.com/office/word/2015/wordml/symex" xmlns:wpg="http://schemas.microsoft.com/office/word/2010/wordprocessingGroup" xmlns:wpi="http://schemas.microsoft.com/office/word/2010/wordprocessingInk" xmlns:wne="http://schemas.microsoft.com/office/word/2006/wordml" xmlns:wps="http://schemas.microsoft.com/office/word/2010/wordprocessingShape" mc:Ignorable="w14 w15 w16se w16cid w16 w16cex w16sdtdh wp14">
   <w:p>
     <w:pPr>
       <w:pBdr>
@@ -566,6 +598,16 @@
         <w:szCs w:val="24"/>
       </w:rPr>
     </w:pPr>
+    <w:bookmarkStart w:id="10" w:name="_Hlk240646114"/>
+    <w:bookmarkStart w:id="11" w:name="_Hlk240646115"/>
+    <w:bookmarkStart w:id="12" w:name="_Hlk240646243"/>
+    <w:bookmarkStart w:id="13" w:name="_Hlk240646244"/>
+    <w:bookmarkStart w:id="14" w:name="_Hlk240646289"/>
+    <w:bookmarkStart w:id="15" w:name="_Hlk240646290"/>
+    <w:bookmarkStart w:id="16" w:name="_Hlk240646366"/>
+    <w:bookmarkStart w:id="17" w:name="_Hlk240646367"/>
+    <w:bookmarkStart w:id="18" w:name="_Hlk240646404"/>
+    <w:bookmarkStart w:id="19" w:name="_Hlk240646405"/>
     <w:r>
       <w:pict w14:anchorId="68B3BD06">
         <v:rect id="_x0000_i1026" style="width:0;height:1.5pt" o:hralign="center" o:hrstd="t" o:hr="t" fillcolor="#a0a0a0" stroked="f"/>
@@ -826,12 +868,32 @@
       </w:rPr>
       <w:t xml:space="preserve"> </w:t>
     </w:r>
+    <w:bookmarkEnd w:id="10"/>
+    <w:bookmarkEnd w:id="11"/>
+    <w:bookmarkEnd w:id="12"/>
+    <w:bookmarkEnd w:id="13"/>
+    <w:bookmarkEnd w:id="14"/>
+    <w:bookmarkEnd w:id="15"/>
+    <w:bookmarkEnd w:id="16"/>
+    <w:bookmarkEnd w:id="17"/>
+    <w:bookmarkEnd w:id="18"/>
+    <w:bookmarkEnd w:id="19"/>
+  </w:p>
+</w:ftr>
+</file>
+
+<file path=word/footer3.xml><?xml version="1.0" encoding="utf-8"?>
+<w:ftr xmlns:wpc="http://schemas.microsoft.com/office/word/2010/wordprocessingCanvas" xmlns:cx="http://schemas.microsoft.com/office/drawing/2014/chartex" xmlns:cx1="http://schemas.microsoft.com/office/drawing/2015/9/8/chartex" xmlns:cx2="http://schemas.microsoft.com/office/drawing/2015/10/21/chartex" xmlns:cx3="http://schemas.microsoft.com/office/drawing/2016/5/9/chartex" xmlns:cx4="http://schemas.microsoft.com/office/drawing/2016/5/10/chartex" xmlns:cx5="http://schemas.microsoft.com/office/drawing/2016/5/11/chartex" xmlns:cx6="http://schemas.microsoft.com/office/drawing/2016/5/12/chartex" xmlns:cx7="http://schemas.microsoft.com/office/drawing/2016/5/13/chartex" xmlns:cx8="http://schemas.microsoft.com/office/drawing/2016/5/14/chartex" xmlns:mc="http://schemas.openxmlformats.org/markup-compatibility/2006" xmlns:aink="http://schemas.microsoft.com/office/drawing/2016/ink" xmlns:am3d="http://schemas.microsoft.com/office/drawing/2017/model3d" xmlns:o="urn:schemas-microsoft-com:office:office" xmlns:oel="http://schemas.microsoft.com/office/2019/extlst" xmlns:r="http://schemas.openxmlformats.org/officeDocument/2006/relationships" xmlns:m="http://schemas.openxmlformats.org/officeDocument/2006/math" xmlns:v="urn:schemas-microsoft-com:vml" xmlns:wp14="http://schemas.microsoft.com/office/word/2010/wordprocessingDrawing" xmlns:wp="http://schemas.openxmlformats.org/drawingml/2006/wordprocessingDrawing" xmlns:w10="urn:schemas-microsoft-com:office:word" xmlns:w="http://schemas.openxmlformats.org/wordprocessingml/2006/main" xmlns:w14="http://schemas.microsoft.com/office/word/2010/wordml" xmlns:w15="http://schemas.microsoft.com/office/word/2012/wordml" xmlns:w16cex="http://schemas.microsoft.com/office/word/2018/wordml/cex" xmlns:w16cid="http://schemas.microsoft.com/office/word/2016/wordml/cid" xmlns:w16="http://schemas.microsoft.com/office/word/2018/wordml" xmlns:w16sdtdh="http://schemas.microsoft.com/office/word/2020/wordml/sdtdatahash" xmlns:w16se="http://schemas.microsoft.com/office/word/2015/wordml/symex" xmlns:wpg="http://schemas.microsoft.com/office/word/2010/wordprocessingGroup" xmlns:wpi="http://schemas.microsoft.com/office/word/2010/wordprocessingInk" xmlns:wne="http://schemas.microsoft.com/office/word/2006/wordml" xmlns:wps="http://schemas.microsoft.com/office/word/2010/wordprocessingShape" mc:Ignorable="w14 w15 w16se w16cid w16 w16cex w16sdtdh wp14">
+  <w:p>
+    <w:pPr>
+      <w:pStyle w:val="Rodap"/>
+    </w:pPr>
   </w:p>
 </w:ftr>
 </file>
 
 <file path=word/footnotes.xml><?xml version="1.0" encoding="utf-8"?>
-<w:footnotes xmlns:wpc="http://schemas.microsoft.com/office/word/2010/wordprocessingCanvas" xmlns:cx="http://schemas.microsoft.com/office/drawing/2014/chartex" xmlns:cx1="http://schemas.microsoft.com/office/drawing/2015/9/8/chartex" xmlns:cx2="http://schemas.microsoft.com/office/drawing/2015/10/21/chartex" xmlns:cx3="http://schemas.microsoft.com/office/drawing/2016/5/9/chartex" xmlns:cx4="http://schemas.microsoft.com/office/drawing/2016/5/10/chartex" xmlns:cx5="http://schemas.microsoft.com/office/drawing/2016/5/11/chartex" xmlns:cx6="http://schemas.microsoft.com/office/drawing/2016/5/12/chartex" xmlns:cx7="http://schemas.microsoft.com/office/drawing/2016/5/13/chartex" xmlns:cx8="http://schemas.microsoft.com/office/drawing/2016/5/14/chartex" xmlns:mc="http://schemas.openxmlformats.org/markup-compatibility/2006" xmlns:aink="http://schemas.microsoft.com/office/drawing/2016/ink" xmlns:am3d="http://schemas.microsoft.com/office/drawing/2017/model3d" xmlns:o="urn:schemas-microsoft-com:office:office" xmlns:oel="http://schemas.microsoft.com/office/2019/extlst" xmlns:r="http://schemas.openxmlformats.org/officeDocument/2006/relationships" xmlns:m="http://schemas.openxmlformats.org/officeDocument/2006/math" xmlns:v="urn:schemas-microsoft-com:vml" xmlns:wp14="http://schemas.microsoft.com/office/word/2010/wordprocessingDrawing" xmlns:wp="http://schemas.openxmlformats.org/drawingml/2006/wordprocessingDrawing" xmlns:w10="urn:schemas-microsoft-com:office:word" xmlns:w="http://schemas.openxmlformats.org/wordprocessingml/2006/main" xmlns:w14="http://schemas.microsoft.com/office/word/2010/wordml" xmlns:w15="http://schemas.microsoft.com/office/word/2012/wordml" xmlns:w16cex="http://schemas.microsoft.com/office/word/2018/wordml/cex" xmlns:w16cid="http://schemas.microsoft.com/office/word/2016/wordml/cid" xmlns:w16="http://schemas.microsoft.com/office/word/2018/wordml" xmlns:w16du="http://schemas.microsoft.com/office/word/2023/wordml/word16du" xmlns:w16sdtdh="http://schemas.microsoft.com/office/word/2020/wordml/sdtdatahash" xmlns:w16sdtfl="http://schemas.microsoft.com/office/word/2024/wordml/sdtformatlock" xmlns:w16se="http://schemas.microsoft.com/office/word/2015/wordml/symex" xmlns:wpg="http://schemas.microsoft.com/office/word/2010/wordprocessingGroup" xmlns:wpi="http://schemas.microsoft.com/office/word/2010/wordprocessingInk" xmlns:wne="http://schemas.microsoft.com/office/word/2006/wordml" xmlns:wps="http://schemas.microsoft.com/office/word/2010/wordprocessingShape" mc:Ignorable="w14 w15 w16se w16cid w16 w16cex w16sdtdh w16sdtfl w16du wp14">
+<w:footnotes xmlns:wpc="http://schemas.microsoft.com/office/word/2010/wordprocessingCanvas" xmlns:cx="http://schemas.microsoft.com/office/drawing/2014/chartex" xmlns:cx1="http://schemas.microsoft.com/office/drawing/2015/9/8/chartex" xmlns:cx2="http://schemas.microsoft.com/office/drawing/2015/10/21/chartex" xmlns:cx3="http://schemas.microsoft.com/office/drawing/2016/5/9/chartex" xmlns:cx4="http://schemas.microsoft.com/office/drawing/2016/5/10/chartex" xmlns:cx5="http://schemas.microsoft.com/office/drawing/2016/5/11/chartex" xmlns:cx6="http://schemas.microsoft.com/office/drawing/2016/5/12/chartex" xmlns:cx7="http://schemas.microsoft.com/office/drawing/2016/5/13/chartex" xmlns:cx8="http://schemas.microsoft.com/office/drawing/2016/5/14/chartex" xmlns:mc="http://schemas.openxmlformats.org/markup-compatibility/2006" xmlns:aink="http://schemas.microsoft.com/office/drawing/2016/ink" xmlns:am3d="http://schemas.microsoft.com/office/drawing/2017/model3d" xmlns:o="urn:schemas-microsoft-com:office:office" xmlns:oel="http://schemas.microsoft.com/office/2019/extlst" xmlns:r="http://schemas.openxmlformats.org/officeDocument/2006/relationships" xmlns:m="http://schemas.openxmlformats.org/officeDocument/2006/math" xmlns:v="urn:schemas-microsoft-com:vml" xmlns:wp14="http://schemas.microsoft.com/office/word/2010/wordprocessingDrawing" xmlns:wp="http://schemas.openxmlformats.org/drawingml/2006/wordprocessingDrawing" xmlns:w10="urn:schemas-microsoft-com:office:word" xmlns:w="http://schemas.openxmlformats.org/wordprocessingml/2006/main" xmlns:w14="http://schemas.microsoft.com/office/word/2010/wordml" xmlns:w15="http://schemas.microsoft.com/office/word/2012/wordml" xmlns:w16cex="http://schemas.microsoft.com/office/word/2018/wordml/cex" xmlns:w16cid="http://schemas.microsoft.com/office/word/2016/wordml/cid" xmlns:w16="http://schemas.microsoft.com/office/word/2018/wordml" xmlns:w16sdtdh="http://schemas.microsoft.com/office/word/2020/wordml/sdtdatahash" xmlns:w16se="http://schemas.microsoft.com/office/word/2015/wordml/symex" xmlns:wpg="http://schemas.microsoft.com/office/word/2010/wordprocessingGroup" xmlns:wpi="http://schemas.microsoft.com/office/word/2010/wordprocessingInk" xmlns:wne="http://schemas.microsoft.com/office/word/2006/wordml" xmlns:wps="http://schemas.microsoft.com/office/word/2010/wordprocessingShape" mc:Ignorable="w14 w15 w16se w16cid w16 w16cex w16sdtdh wp14">
   <w:footnote w:type="separator" w:id="-1">
     <w:p>
       <w:pPr>
@@ -856,7 +918,17 @@
 </file>
 
 <file path=word/header1.xml><?xml version="1.0" encoding="utf-8"?>
-<w:hdr xmlns:wpc="http://schemas.microsoft.com/office/word/2010/wordprocessingCanvas" xmlns:cx="http://schemas.microsoft.com/office/drawing/2014/chartex" xmlns:cx1="http://schemas.microsoft.com/office/drawing/2015/9/8/chartex" xmlns:cx2="http://schemas.microsoft.com/office/drawing/2015/10/21/chartex" xmlns:cx3="http://schemas.microsoft.com/office/drawing/2016/5/9/chartex" xmlns:cx4="http://schemas.microsoft.com/office/drawing/2016/5/10/chartex" xmlns:cx5="http://schemas.microsoft.com/office/drawing/2016/5/11/chartex" xmlns:cx6="http://schemas.microsoft.com/office/drawing/2016/5/12/chartex" xmlns:cx7="http://schemas.microsoft.com/office/drawing/2016/5/13/chartex" xmlns:cx8="http://schemas.microsoft.com/office/drawing/2016/5/14/chartex" xmlns:mc="http://schemas.openxmlformats.org/markup-compatibility/2006" xmlns:aink="http://schemas.microsoft.com/office/drawing/2016/ink" xmlns:am3d="http://schemas.microsoft.com/office/drawing/2017/model3d" xmlns:o="urn:schemas-microsoft-com:office:office" xmlns:oel="http://schemas.microsoft.com/office/2019/extlst" xmlns:r="http://schemas.openxmlformats.org/officeDocument/2006/relationships" xmlns:m="http://schemas.openxmlformats.org/officeDocument/2006/math" xmlns:v="urn:schemas-microsoft-com:vml" xmlns:wp14="http://schemas.microsoft.com/office/word/2010/wordprocessingDrawing" xmlns:wp="http://schemas.openxmlformats.org/drawingml/2006/wordprocessingDrawing" xmlns:w10="urn:schemas-microsoft-com:office:word" xmlns:w="http://schemas.openxmlformats.org/wordprocessingml/2006/main" xmlns:w14="http://schemas.microsoft.com/office/word/2010/wordml" xmlns:w15="http://schemas.microsoft.com/office/word/2012/wordml" xmlns:w16cex="http://schemas.microsoft.com/office/word/2018/wordml/cex" xmlns:w16cid="http://schemas.microsoft.com/office/word/2016/wordml/cid" xmlns:w16="http://schemas.microsoft.com/office/word/2018/wordml" xmlns:w16du="http://schemas.microsoft.com/office/word/2023/wordml/word16du" xmlns:w16sdtdh="http://schemas.microsoft.com/office/word/2020/wordml/sdtdatahash" xmlns:w16sdtfl="http://schemas.microsoft.com/office/word/2024/wordml/sdtformatlock" xmlns:w16se="http://schemas.microsoft.com/office/word/2015/wordml/symex" xmlns:wpg="http://schemas.microsoft.com/office/word/2010/wordprocessingGroup" xmlns:wpi="http://schemas.microsoft.com/office/word/2010/wordprocessingInk" xmlns:wne="http://schemas.microsoft.com/office/word/2006/wordml" xmlns:wps="http://schemas.microsoft.com/office/word/2010/wordprocessingShape" mc:Ignorable="w14 w15 w16se w16cid w16 w16cex w16sdtdh w16sdtfl w16du wp14">
+<w:hdr xmlns:wpc="http://schemas.microsoft.com/office/word/2010/wordprocessingCanvas" xmlns:cx="http://schemas.microsoft.com/office/drawing/2014/chartex" xmlns:cx1="http://schemas.microsoft.com/office/drawing/2015/9/8/chartex" xmlns:cx2="http://schemas.microsoft.com/office/drawing/2015/10/21/chartex" xmlns:cx3="http://schemas.microsoft.com/office/drawing/2016/5/9/chartex" xmlns:cx4="http://schemas.microsoft.com/office/drawing/2016/5/10/chartex" xmlns:cx5="http://schemas.microsoft.com/office/drawing/2016/5/11/chartex" xmlns:cx6="http://schemas.microsoft.com/office/drawing/2016/5/12/chartex" xmlns:cx7="http://schemas.microsoft.com/office/drawing/2016/5/13/chartex" xmlns:cx8="http://schemas.microsoft.com/office/drawing/2016/5/14/chartex" xmlns:mc="http://schemas.openxmlformats.org/markup-compatibility/2006" xmlns:aink="http://schemas.microsoft.com/office/drawing/2016/ink" xmlns:am3d="http://schemas.microsoft.com/office/drawing/2017/model3d" xmlns:o="urn:schemas-microsoft-com:office:office" xmlns:oel="http://schemas.microsoft.com/office/2019/extlst" xmlns:r="http://schemas.openxmlformats.org/officeDocument/2006/relationships" xmlns:m="http://schemas.openxmlformats.org/officeDocument/2006/math" xmlns:v="urn:schemas-microsoft-com:vml" xmlns:wp14="http://schemas.microsoft.com/office/word/2010/wordprocessingDrawing" xmlns:wp="http://schemas.openxmlformats.org/drawingml/2006/wordprocessingDrawing" xmlns:w10="urn:schemas-microsoft-com:office:word" xmlns:w="http://schemas.openxmlformats.org/wordprocessingml/2006/main" xmlns:w14="http://schemas.microsoft.com/office/word/2010/wordml" xmlns:w15="http://schemas.microsoft.com/office/word/2012/wordml" xmlns:w16cex="http://schemas.microsoft.com/office/word/2018/wordml/cex" xmlns:w16cid="http://schemas.microsoft.com/office/word/2016/wordml/cid" xmlns:w16="http://schemas.microsoft.com/office/word/2018/wordml" xmlns:w16sdtdh="http://schemas.microsoft.com/office/word/2020/wordml/sdtdatahash" xmlns:w16se="http://schemas.microsoft.com/office/word/2015/wordml/symex" xmlns:wpg="http://schemas.microsoft.com/office/word/2010/wordprocessingGroup" xmlns:wpi="http://schemas.microsoft.com/office/word/2010/wordprocessingInk" xmlns:wne="http://schemas.microsoft.com/office/word/2006/wordml" xmlns:wps="http://schemas.microsoft.com/office/word/2010/wordprocessingShape" mc:Ignorable="w14 w15 w16se w16cid w16 w16cex w16sdtdh wp14">
+  <w:p>
+    <w:pPr>
+      <w:pStyle w:val="Cabealho"/>
+    </w:pPr>
+  </w:p>
+</w:hdr>
+</file>
+
+<file path=word/header2.xml><?xml version="1.0" encoding="utf-8"?>
+<w:hdr xmlns:wpc="http://schemas.microsoft.com/office/word/2010/wordprocessingCanvas" xmlns:cx="http://schemas.microsoft.com/office/drawing/2014/chartex" xmlns:cx1="http://schemas.microsoft.com/office/drawing/2015/9/8/chartex" xmlns:cx2="http://schemas.microsoft.com/office/drawing/2015/10/21/chartex" xmlns:cx3="http://schemas.microsoft.com/office/drawing/2016/5/9/chartex" xmlns:cx4="http://schemas.microsoft.com/office/drawing/2016/5/10/chartex" xmlns:cx5="http://schemas.microsoft.com/office/drawing/2016/5/11/chartex" xmlns:cx6="http://schemas.microsoft.com/office/drawing/2016/5/12/chartex" xmlns:cx7="http://schemas.microsoft.com/office/drawing/2016/5/13/chartex" xmlns:cx8="http://schemas.microsoft.com/office/drawing/2016/5/14/chartex" xmlns:mc="http://schemas.openxmlformats.org/markup-compatibility/2006" xmlns:aink="http://schemas.microsoft.com/office/drawing/2016/ink" xmlns:am3d="http://schemas.microsoft.com/office/drawing/2017/model3d" xmlns:o="urn:schemas-microsoft-com:office:office" xmlns:oel="http://schemas.microsoft.com/office/2019/extlst" xmlns:r="http://schemas.openxmlformats.org/officeDocument/2006/relationships" xmlns:m="http://schemas.openxmlformats.org/officeDocument/2006/math" xmlns:v="urn:schemas-microsoft-com:vml" xmlns:wp14="http://schemas.microsoft.com/office/word/2010/wordprocessingDrawing" xmlns:wp="http://schemas.openxmlformats.org/drawingml/2006/wordprocessingDrawing" xmlns:w10="urn:schemas-microsoft-com:office:word" xmlns:w="http://schemas.openxmlformats.org/wordprocessingml/2006/main" xmlns:w14="http://schemas.microsoft.com/office/word/2010/wordml" xmlns:w15="http://schemas.microsoft.com/office/word/2012/wordml" xmlns:w16cex="http://schemas.microsoft.com/office/word/2018/wordml/cex" xmlns:w16cid="http://schemas.microsoft.com/office/word/2016/wordml/cid" xmlns:w16="http://schemas.microsoft.com/office/word/2018/wordml" xmlns:w16sdtdh="http://schemas.microsoft.com/office/word/2020/wordml/sdtdatahash" xmlns:w16se="http://schemas.microsoft.com/office/word/2015/wordml/symex" xmlns:wpg="http://schemas.microsoft.com/office/word/2010/wordprocessingGroup" xmlns:wpi="http://schemas.microsoft.com/office/word/2010/wordprocessingInk" xmlns:wne="http://schemas.microsoft.com/office/word/2006/wordml" xmlns:wps="http://schemas.microsoft.com/office/word/2010/wordprocessingShape" mc:Ignorable="w14 w15 w16se w16cid w16 w16cex w16sdtdh wp14">
   <w:p>
     <w:pPr>
       <w:pBdr>
@@ -1024,8 +1096,18 @@
 </w:hdr>
 </file>
 
+<file path=word/header3.xml><?xml version="1.0" encoding="utf-8"?>
+<w:hdr xmlns:wpc="http://schemas.microsoft.com/office/word/2010/wordprocessingCanvas" xmlns:cx="http://schemas.microsoft.com/office/drawing/2014/chartex" xmlns:cx1="http://schemas.microsoft.com/office/drawing/2015/9/8/chartex" xmlns:cx2="http://schemas.microsoft.com/office/drawing/2015/10/21/chartex" xmlns:cx3="http://schemas.microsoft.com/office/drawing/2016/5/9/chartex" xmlns:cx4="http://schemas.microsoft.com/office/drawing/2016/5/10/chartex" xmlns:cx5="http://schemas.microsoft.com/office/drawing/2016/5/11/chartex" xmlns:cx6="http://schemas.microsoft.com/office/drawing/2016/5/12/chartex" xmlns:cx7="http://schemas.microsoft.com/office/drawing/2016/5/13/chartex" xmlns:cx8="http://schemas.microsoft.com/office/drawing/2016/5/14/chartex" xmlns:mc="http://schemas.openxmlformats.org/markup-compatibility/2006" xmlns:aink="http://schemas.microsoft.com/office/drawing/2016/ink" xmlns:am3d="http://schemas.microsoft.com/office/drawing/2017/model3d" xmlns:o="urn:schemas-microsoft-com:office:office" xmlns:oel="http://schemas.microsoft.com/office/2019/extlst" xmlns:r="http://schemas.openxmlformats.org/officeDocument/2006/relationships" xmlns:m="http://schemas.openxmlformats.org/officeDocument/2006/math" xmlns:v="urn:schemas-microsoft-com:vml" xmlns:wp14="http://schemas.microsoft.com/office/word/2010/wordprocessingDrawing" xmlns:wp="http://schemas.openxmlformats.org/drawingml/2006/wordprocessingDrawing" xmlns:w10="urn:schemas-microsoft-com:office:word" xmlns:w="http://schemas.openxmlformats.org/wordprocessingml/2006/main" xmlns:w14="http://schemas.microsoft.com/office/word/2010/wordml" xmlns:w15="http://schemas.microsoft.com/office/word/2012/wordml" xmlns:w16cex="http://schemas.microsoft.com/office/word/2018/wordml/cex" xmlns:w16cid="http://schemas.microsoft.com/office/word/2016/wordml/cid" xmlns:w16="http://schemas.microsoft.com/office/word/2018/wordml" xmlns:w16sdtdh="http://schemas.microsoft.com/office/word/2020/wordml/sdtdatahash" xmlns:w16se="http://schemas.microsoft.com/office/word/2015/wordml/symex" xmlns:wpg="http://schemas.microsoft.com/office/word/2010/wordprocessingGroup" xmlns:wpi="http://schemas.microsoft.com/office/word/2010/wordprocessingInk" xmlns:wne="http://schemas.microsoft.com/office/word/2006/wordml" xmlns:wps="http://schemas.microsoft.com/office/word/2010/wordprocessingShape" mc:Ignorable="w14 w15 w16se w16cid w16 w16cex w16sdtdh wp14">
+  <w:p>
+    <w:pPr>
+      <w:pStyle w:val="Cabealho"/>
+    </w:pPr>
+  </w:p>
+</w:hdr>
+</file>
+
 <file path=word/styles.xml><?xml version="1.0" encoding="utf-8"?>
-<w:styles xmlns:mc="http://schemas.openxmlformats.org/markup-compatibility/2006" xmlns:r="http://schemas.openxmlformats.org/officeDocument/2006/relationships" xmlns:w="http://schemas.openxmlformats.org/wordprocessingml/2006/main" xmlns:w14="http://schemas.microsoft.com/office/word/2010/wordml" xmlns:w15="http://schemas.microsoft.com/office/word/2012/wordml" xmlns:w16cex="http://schemas.microsoft.com/office/word/2018/wordml/cex" xmlns:w16cid="http://schemas.microsoft.com/office/word/2016/wordml/cid" xmlns:w16="http://schemas.microsoft.com/office/word/2018/wordml" xmlns:w16du="http://schemas.microsoft.com/office/word/2023/wordml/word16du" xmlns:w16sdtdh="http://schemas.microsoft.com/office/word/2020/wordml/sdtdatahash" xmlns:w16sdtfl="http://schemas.microsoft.com/office/word/2024/wordml/sdtformatlock" xmlns:w16se="http://schemas.microsoft.com/office/word/2015/wordml/symex" mc:Ignorable="w14 w15 w16se w16cid w16 w16cex w16sdtdh w16sdtfl w16du">
+<w:styles xmlns:mc="http://schemas.openxmlformats.org/markup-compatibility/2006" xmlns:r="http://schemas.openxmlformats.org/officeDocument/2006/relationships" xmlns:w="http://schemas.openxmlformats.org/wordprocessingml/2006/main" xmlns:w14="http://schemas.microsoft.com/office/word/2010/wordml" xmlns:w15="http://schemas.microsoft.com/office/word/2012/wordml" xmlns:w16cex="http://schemas.microsoft.com/office/word/2018/wordml/cex" xmlns:w16cid="http://schemas.microsoft.com/office/word/2016/wordml/cid" xmlns:w16="http://schemas.microsoft.com/office/word/2018/wordml" xmlns:w16sdtdh="http://schemas.microsoft.com/office/word/2020/wordml/sdtdatahash" xmlns:w16se="http://schemas.microsoft.com/office/word/2015/wordml/symex" mc:Ignorable="w14 w15 w16se w16cid w16 w16cex w16sdtdh">
   <w:docDefaults>
     <w:rPrDefault>
       <w:rPr>
@@ -2024,28 +2106,28 @@
 </file>
 
 <file path=customXml/item1.xml><?xml version="1.0" encoding="utf-8"?>
+<b:Sources xmlns:b="http://schemas.openxmlformats.org/officeDocument/2006/bibliography" xmlns="http://schemas.openxmlformats.org/officeDocument/2006/bibliography" SelectedStyle="\APASixthEditionOfficeOnline.xsl" StyleName="APA" Version="6"/>
+</file>
+
+<file path=customXml/item2.xml><?xml version="1.0" encoding="utf-8"?>
 <go:gDocsCustomXmlDataStorage xmlns:go="http://customooxmlschemas.google.com/" xmlns:r="http://schemas.openxmlformats.org/officeDocument/2006/relationships" uri="GoogleDocsCustomDataVersion1">
   <go:docsCustomData xmlns:go="http://customooxmlschemas.google.com/" roundtripDataSignature="AMtx7miCx+Nu1CPxqyL/BBGXTkNdiiVvgw==">AMUW2mX/OVMyNlh2esYtbXT3leA1tYR2EznNX3z+Dl88UXy2V04ZLpq90b6km9uqFoVU9JxR87mfj8k28kh8ZoWHzHITGgASyFaL7cKbMF4QChURDliJMsQ=</go:docsCustomData>
 </go:gDocsCustomXmlDataStorage>
 </file>
 
-<file path=customXml/item2.xml><?xml version="1.0" encoding="utf-8"?>
-<b:Sources xmlns:b="http://schemas.openxmlformats.org/officeDocument/2006/bibliography" xmlns="http://schemas.openxmlformats.org/officeDocument/2006/bibliography" SelectedStyle="\APASixthEditionOfficeOnline.xsl" StyleName="APA" Version="6"/>
+<file path=customXml/itemProps1.xml><?xml version="1.0" encoding="utf-8"?>
+<ds:datastoreItem xmlns:ds="http://schemas.openxmlformats.org/officeDocument/2006/customXml" ds:itemID="{C62CC713-402D-4CBA-AF6B-59D6E847A0FF}">
+  <ds:schemaRefs>
+    <ds:schemaRef ds:uri="http://schemas.openxmlformats.org/officeDocument/2006/bibliography"/>
+  </ds:schemaRefs>
+</ds:datastoreItem>
 </file>
 
-<file path=customXml/itemProps1.xml><?xml version="1.0" encoding="utf-8"?>
+<file path=customXml/itemProps2.xml><?xml version="1.0" encoding="utf-8"?>
 <ds:datastoreItem xmlns:ds="http://schemas.openxmlformats.org/officeDocument/2006/customXml" ds:itemID="{11111111-1234-1234-1234-123412341234}">
   <ds:schemaRefs>
     <ds:schemaRef ds:uri="http://customooxmlschemas.google.com/"/>
     <ds:schemaRef ds:uri="http://schemas.openxmlformats.org/officeDocument/2006/relationships"/>
   </ds:schemaRefs>
 </ds:datastoreItem>
-</file>
-
-<file path=customXml/itemProps2.xml><?xml version="1.0" encoding="utf-8"?>
-<ds:datastoreItem xmlns:ds="http://schemas.openxmlformats.org/officeDocument/2006/customXml" ds:itemID="{C62CC713-402D-4CBA-AF6B-59D6E847A0FF}">
-  <ds:schemaRefs>
-    <ds:schemaRef ds:uri="http://schemas.openxmlformats.org/officeDocument/2006/bibliography"/>
-  </ds:schemaRefs>
-</ds:datastoreItem>
 </file>
</xml_diff>